<commit_message>
Ajustada imagen y agregado CFA
</commit_message>
<xml_diff>
--- a/fuentes/CFA1_63220007_DU.docx
+++ b/fuentes/CFA1_63220007_DU.docx
@@ -2,6 +2,13 @@
 <file path=word/document.xml><?xml version="1.0" encoding="utf-8"?>
 <w:document xmlns:wpc="http://schemas.microsoft.com/office/word/2010/wordprocessingCanvas" xmlns:cx="http://schemas.microsoft.com/office/drawing/2014/chartex" xmlns:cx1="http://schemas.microsoft.com/office/drawing/2015/9/8/chartex" xmlns:cx2="http://schemas.microsoft.com/office/drawing/2015/10/21/chartex" xmlns:cx3="http://schemas.microsoft.com/office/drawing/2016/5/9/chartex" xmlns:cx4="http://schemas.microsoft.com/office/drawing/2016/5/10/chartex" xmlns:cx5="http://schemas.microsoft.com/office/drawing/2016/5/11/chartex" xmlns:cx6="http://schemas.microsoft.com/office/drawing/2016/5/12/chartex" xmlns:cx7="http://schemas.microsoft.com/office/drawing/2016/5/13/chartex" xmlns:cx8="http://schemas.microsoft.com/office/drawing/2016/5/14/chartex" xmlns:mc="http://schemas.openxmlformats.org/markup-compatibility/2006" xmlns:aink="http://schemas.microsoft.com/office/drawing/2016/ink" xmlns:am3d="http://schemas.microsoft.com/office/drawing/2017/model3d" xmlns:o="urn:schemas-microsoft-com:office:office" xmlns:r="http://schemas.openxmlformats.org/officeDocument/2006/relationships" xmlns:m="http://schemas.openxmlformats.org/officeDocument/2006/math" xmlns:v="urn:schemas-microsoft-com:vml" xmlns:wp14="http://schemas.microsoft.com/office/word/2010/wordprocessingDrawing" xmlns:wp="http://schemas.openxmlformats.org/drawingml/2006/wordprocessingDrawing" xmlns:w10="urn:schemas-microsoft-com:office:word" xmlns:w="http://schemas.openxmlformats.org/wordprocessingml/2006/main" xmlns:w14="http://schemas.microsoft.com/office/word/2010/wordml" xmlns:w15="http://schemas.microsoft.com/office/word/2012/wordml" xmlns:w16cex="http://schemas.microsoft.com/office/word/2018/wordml/cex" xmlns:w16cid="http://schemas.microsoft.com/office/word/2016/wordml/cid" xmlns:w16="http://schemas.microsoft.com/office/word/2018/wordml" xmlns:w16sdtdh="http://schemas.microsoft.com/office/word/2020/wordml/sdtdatahash" xmlns:w16se="http://schemas.microsoft.com/office/word/2015/wordml/symex" xmlns:wpg="http://schemas.microsoft.com/office/word/2010/wordprocessingGroup" xmlns:wpi="http://schemas.microsoft.com/office/word/2010/wordprocessingInk" xmlns:wne="http://schemas.microsoft.com/office/word/2006/wordml" xmlns:wps="http://schemas.microsoft.com/office/word/2010/wordprocessingShape" mc:Ignorable="w14 w15 w16se w16cid w16 w16cex w16sdtdh wp14">
   <w:body>
+    <w:p>
+      <w:pPr>
+        <w:rPr>
+          <w:lang w:val="es-419"/>
+        </w:rPr>
+      </w:pPr>
+    </w:p>
     <w:p>
       <w:pPr>
         <w:rPr>
@@ -590,7 +597,7 @@
           <w:r>
             <w:fldChar w:fldCharType="separate"/>
           </w:r>
-          <w:hyperlink w:anchor="_Toc207620982" w:history="1">
+          <w:hyperlink w:anchor="_Toc208928032" w:history="1">
             <w:r>
               <w:rPr>
                 <w:rStyle w:val="Hipervnculo"/>
@@ -617,7 +624,7 @@
                 <w:noProof/>
                 <w:webHidden/>
               </w:rPr>
-              <w:instrText xml:space="preserve"> PAGEREF _Toc207620982 \h </w:instrText>
+              <w:instrText xml:space="preserve"> PAGEREF _Toc208928032 \h </w:instrText>
             </w:r>
             <w:r>
               <w:rPr>
@@ -664,7 +671,7 @@
               <w14:ligatures w14:val="none"/>
             </w:rPr>
           </w:pPr>
-          <w:hyperlink w:anchor="_Toc207620983" w:history="1">
+          <w:hyperlink w:anchor="_Toc208928033" w:history="1">
             <w:r>
               <w:rPr>
                 <w:rStyle w:val="Hipervnculo"/>
@@ -709,7 +716,7 @@
                 <w:noProof/>
                 <w:webHidden/>
               </w:rPr>
-              <w:instrText xml:space="preserve"> PAGEREF _Toc207620983 \h </w:instrText>
+              <w:instrText xml:space="preserve"> PAGEREF _Toc208928033 \h </w:instrText>
             </w:r>
             <w:r>
               <w:rPr>
@@ -752,7 +759,7 @@
               <w14:ligatures w14:val="none"/>
             </w:rPr>
           </w:pPr>
-          <w:hyperlink w:anchor="_Toc207620984" w:history="1">
+          <w:hyperlink w:anchor="_Toc208928034" w:history="1">
             <w:r>
               <w:rPr>
                 <w:rStyle w:val="Hipervnculo"/>
@@ -797,7 +804,7 @@
                 <w:noProof/>
                 <w:webHidden/>
               </w:rPr>
-              <w:instrText xml:space="preserve"> PAGEREF _Toc207620984 \h </w:instrText>
+              <w:instrText xml:space="preserve"> PAGEREF _Toc208928034 \h </w:instrText>
             </w:r>
             <w:r>
               <w:rPr>
@@ -840,7 +847,7 @@
               <w14:ligatures w14:val="none"/>
             </w:rPr>
           </w:pPr>
-          <w:hyperlink w:anchor="_Toc207620985" w:history="1">
+          <w:hyperlink w:anchor="_Toc208928035" w:history="1">
             <w:r>
               <w:rPr>
                 <w:rStyle w:val="Hipervnculo"/>
@@ -885,7 +892,7 @@
                 <w:noProof/>
                 <w:webHidden/>
               </w:rPr>
-              <w:instrText xml:space="preserve"> PAGEREF _Toc207620985 \h </w:instrText>
+              <w:instrText xml:space="preserve"> PAGEREF _Toc208928035 \h </w:instrText>
             </w:r>
             <w:r>
               <w:rPr>
@@ -932,7 +939,7 @@
               <w14:ligatures w14:val="none"/>
             </w:rPr>
           </w:pPr>
-          <w:hyperlink w:anchor="_Toc207620986" w:history="1">
+          <w:hyperlink w:anchor="_Toc208928036" w:history="1">
             <w:r>
               <w:rPr>
                 <w:rStyle w:val="Hipervnculo"/>
@@ -977,7 +984,7 @@
                 <w:noProof/>
                 <w:webHidden/>
               </w:rPr>
-              <w:instrText xml:space="preserve"> PAGEREF _Toc207620986 \h </w:instrText>
+              <w:instrText xml:space="preserve"> PAGEREF _Toc208928036 \h </w:instrText>
             </w:r>
             <w:r>
               <w:rPr>
@@ -1020,7 +1027,7 @@
               <w14:ligatures w14:val="none"/>
             </w:rPr>
           </w:pPr>
-          <w:hyperlink w:anchor="_Toc207620987" w:history="1">
+          <w:hyperlink w:anchor="_Toc208928037" w:history="1">
             <w:r>
               <w:rPr>
                 <w:rStyle w:val="Hipervnculo"/>
@@ -1065,7 +1072,7 @@
                 <w:noProof/>
                 <w:webHidden/>
               </w:rPr>
-              <w:instrText xml:space="preserve"> PAGEREF _Toc207620987 \h </w:instrText>
+              <w:instrText xml:space="preserve"> PAGEREF _Toc208928037 \h </w:instrText>
             </w:r>
             <w:r>
               <w:rPr>
@@ -1108,7 +1115,7 @@
               <w14:ligatures w14:val="none"/>
             </w:rPr>
           </w:pPr>
-          <w:hyperlink w:anchor="_Toc207620988" w:history="1">
+          <w:hyperlink w:anchor="_Toc208928038" w:history="1">
             <w:r>
               <w:rPr>
                 <w:rStyle w:val="Hipervnculo"/>
@@ -1153,7 +1160,7 @@
                 <w:noProof/>
                 <w:webHidden/>
               </w:rPr>
-              <w:instrText xml:space="preserve"> PAGEREF _Toc207620988 \h </w:instrText>
+              <w:instrText xml:space="preserve"> PAGEREF _Toc208928038 \h </w:instrText>
             </w:r>
             <w:r>
               <w:rPr>
@@ -1196,7 +1203,7 @@
               <w14:ligatures w14:val="none"/>
             </w:rPr>
           </w:pPr>
-          <w:hyperlink w:anchor="_Toc207620989" w:history="1">
+          <w:hyperlink w:anchor="_Toc208928039" w:history="1">
             <w:r>
               <w:rPr>
                 <w:rStyle w:val="Hipervnculo"/>
@@ -1241,7 +1248,7 @@
                 <w:noProof/>
                 <w:webHidden/>
               </w:rPr>
-              <w:instrText xml:space="preserve"> PAGEREF _Toc207620989 \h </w:instrText>
+              <w:instrText xml:space="preserve"> PAGEREF _Toc208928039 \h </w:instrText>
             </w:r>
             <w:r>
               <w:rPr>
@@ -1288,7 +1295,7 @@
               <w14:ligatures w14:val="none"/>
             </w:rPr>
           </w:pPr>
-          <w:hyperlink w:anchor="_Toc207620990" w:history="1">
+          <w:hyperlink w:anchor="_Toc208928040" w:history="1">
             <w:r>
               <w:rPr>
                 <w:rStyle w:val="Hipervnculo"/>
@@ -1333,7 +1340,7 @@
                 <w:noProof/>
                 <w:webHidden/>
               </w:rPr>
-              <w:instrText xml:space="preserve"> PAGEREF _Toc207620990 \h </w:instrText>
+              <w:instrText xml:space="preserve"> PAGEREF _Toc208928040 \h </w:instrText>
             </w:r>
             <w:r>
               <w:rPr>
@@ -1376,7 +1383,7 @@
               <w14:ligatures w14:val="none"/>
             </w:rPr>
           </w:pPr>
-          <w:hyperlink w:anchor="_Toc207620991" w:history="1">
+          <w:hyperlink w:anchor="_Toc208928041" w:history="1">
             <w:r>
               <w:rPr>
                 <w:rStyle w:val="Hipervnculo"/>
@@ -1421,7 +1428,7 @@
                 <w:noProof/>
                 <w:webHidden/>
               </w:rPr>
-              <w:instrText xml:space="preserve"> PAGEREF _Toc207620991 \h </w:instrText>
+              <w:instrText xml:space="preserve"> PAGEREF _Toc208928041 \h </w:instrText>
             </w:r>
             <w:r>
               <w:rPr>
@@ -1464,7 +1471,7 @@
               <w14:ligatures w14:val="none"/>
             </w:rPr>
           </w:pPr>
-          <w:hyperlink w:anchor="_Toc207620992" w:history="1">
+          <w:hyperlink w:anchor="_Toc208928042" w:history="1">
             <w:r>
               <w:rPr>
                 <w:rStyle w:val="Hipervnculo"/>
@@ -1509,7 +1516,7 @@
                 <w:noProof/>
                 <w:webHidden/>
               </w:rPr>
-              <w:instrText xml:space="preserve"> PAGEREF _Toc207620992 \h </w:instrText>
+              <w:instrText xml:space="preserve"> PAGEREF _Toc208928042 \h </w:instrText>
             </w:r>
             <w:r>
               <w:rPr>
@@ -1552,7 +1559,7 @@
               <w14:ligatures w14:val="none"/>
             </w:rPr>
           </w:pPr>
-          <w:hyperlink w:anchor="_Toc207620993" w:history="1">
+          <w:hyperlink w:anchor="_Toc208928043" w:history="1">
             <w:r>
               <w:rPr>
                 <w:rStyle w:val="Hipervnculo"/>
@@ -1597,7 +1604,7 @@
                 <w:noProof/>
                 <w:webHidden/>
               </w:rPr>
-              <w:instrText xml:space="preserve"> PAGEREF _Toc207620993 \h </w:instrText>
+              <w:instrText xml:space="preserve"> PAGEREF _Toc208928043 \h </w:instrText>
             </w:r>
             <w:r>
               <w:rPr>
@@ -1640,7 +1647,7 @@
               <w14:ligatures w14:val="none"/>
             </w:rPr>
           </w:pPr>
-          <w:hyperlink w:anchor="_Toc207620994" w:history="1">
+          <w:hyperlink w:anchor="_Toc208928044" w:history="1">
             <w:r>
               <w:rPr>
                 <w:rStyle w:val="Hipervnculo"/>
@@ -1685,7 +1692,7 @@
                 <w:noProof/>
                 <w:webHidden/>
               </w:rPr>
-              <w:instrText xml:space="preserve"> PAGEREF _Toc207620994 \h </w:instrText>
+              <w:instrText xml:space="preserve"> PAGEREF _Toc208928044 \h </w:instrText>
             </w:r>
             <w:r>
               <w:rPr>
@@ -1728,7 +1735,7 @@
               <w14:ligatures w14:val="none"/>
             </w:rPr>
           </w:pPr>
-          <w:hyperlink w:anchor="_Toc207620995" w:history="1">
+          <w:hyperlink w:anchor="_Toc208928045" w:history="1">
             <w:r>
               <w:rPr>
                 <w:rStyle w:val="Hipervnculo"/>
@@ -1773,7 +1780,7 @@
                 <w:noProof/>
                 <w:webHidden/>
               </w:rPr>
-              <w:instrText xml:space="preserve"> PAGEREF _Toc207620995 \h </w:instrText>
+              <w:instrText xml:space="preserve"> PAGEREF _Toc208928045 \h </w:instrText>
             </w:r>
             <w:r>
               <w:rPr>
@@ -1816,7 +1823,7 @@
               <w14:ligatures w14:val="none"/>
             </w:rPr>
           </w:pPr>
-          <w:hyperlink w:anchor="_Toc207620996" w:history="1">
+          <w:hyperlink w:anchor="_Toc208928046" w:history="1">
             <w:r>
               <w:rPr>
                 <w:rStyle w:val="Hipervnculo"/>
@@ -1861,7 +1868,7 @@
                 <w:noProof/>
                 <w:webHidden/>
               </w:rPr>
-              <w:instrText xml:space="preserve"> PAGEREF _Toc207620996 \h </w:instrText>
+              <w:instrText xml:space="preserve"> PAGEREF _Toc208928046 \h </w:instrText>
             </w:r>
             <w:r>
               <w:rPr>
@@ -1908,7 +1915,7 @@
               <w14:ligatures w14:val="none"/>
             </w:rPr>
           </w:pPr>
-          <w:hyperlink w:anchor="_Toc207620997" w:history="1">
+          <w:hyperlink w:anchor="_Toc208928047" w:history="1">
             <w:r>
               <w:rPr>
                 <w:rStyle w:val="Hipervnculo"/>
@@ -1962,7 +1969,7 @@
                 <w:noProof/>
                 <w:webHidden/>
               </w:rPr>
-              <w:instrText xml:space="preserve"> PAGEREF _Toc207620997 \h </w:instrText>
+              <w:instrText xml:space="preserve"> PAGEREF _Toc208928047 \h </w:instrText>
             </w:r>
             <w:r>
               <w:rPr>
@@ -2009,7 +2016,7 @@
               <w14:ligatures w14:val="none"/>
             </w:rPr>
           </w:pPr>
-          <w:hyperlink w:anchor="_Toc207620998" w:history="1">
+          <w:hyperlink w:anchor="_Toc208928048" w:history="1">
             <w:r>
               <w:rPr>
                 <w:rStyle w:val="Hipervnculo"/>
@@ -2054,7 +2061,7 @@
                 <w:noProof/>
                 <w:webHidden/>
               </w:rPr>
-              <w:instrText xml:space="preserve"> PAGEREF _Toc207620998 \h </w:instrText>
+              <w:instrText xml:space="preserve"> PAGEREF _Toc208928048 \h </w:instrText>
             </w:r>
             <w:r>
               <w:rPr>
@@ -2097,7 +2104,7 @@
               <w14:ligatures w14:val="none"/>
             </w:rPr>
           </w:pPr>
-          <w:hyperlink w:anchor="_Toc207620999" w:history="1">
+          <w:hyperlink w:anchor="_Toc208928049" w:history="1">
             <w:r>
               <w:rPr>
                 <w:rStyle w:val="Hipervnculo"/>
@@ -2142,7 +2149,7 @@
                 <w:noProof/>
                 <w:webHidden/>
               </w:rPr>
-              <w:instrText xml:space="preserve"> PAGEREF _Toc207620999 \h </w:instrText>
+              <w:instrText xml:space="preserve"> PAGEREF _Toc208928049 \h </w:instrText>
             </w:r>
             <w:r>
               <w:rPr>
@@ -2185,7 +2192,7 @@
               <w14:ligatures w14:val="none"/>
             </w:rPr>
           </w:pPr>
-          <w:hyperlink w:anchor="_Toc207621000" w:history="1">
+          <w:hyperlink w:anchor="_Toc208928050" w:history="1">
             <w:r>
               <w:rPr>
                 <w:rStyle w:val="Hipervnculo"/>
@@ -2230,7 +2237,7 @@
                 <w:noProof/>
                 <w:webHidden/>
               </w:rPr>
-              <w:instrText xml:space="preserve"> PAGEREF _Toc207621000 \h </w:instrText>
+              <w:instrText xml:space="preserve"> PAGEREF _Toc208928050 \h </w:instrText>
             </w:r>
             <w:r>
               <w:rPr>
@@ -2273,7 +2280,7 @@
               <w14:ligatures w14:val="none"/>
             </w:rPr>
           </w:pPr>
-          <w:hyperlink w:anchor="_Toc207621001" w:history="1">
+          <w:hyperlink w:anchor="_Toc208928051" w:history="1">
             <w:r>
               <w:rPr>
                 <w:rStyle w:val="Hipervnculo"/>
@@ -2318,7 +2325,7 @@
                 <w:noProof/>
                 <w:webHidden/>
               </w:rPr>
-              <w:instrText xml:space="preserve"> PAGEREF _Toc207621001 \h </w:instrText>
+              <w:instrText xml:space="preserve"> PAGEREF _Toc208928051 \h </w:instrText>
             </w:r>
             <w:r>
               <w:rPr>
@@ -2365,7 +2372,7 @@
               <w14:ligatures w14:val="none"/>
             </w:rPr>
           </w:pPr>
-          <w:hyperlink w:anchor="_Toc207621002" w:history="1">
+          <w:hyperlink w:anchor="_Toc208928052" w:history="1">
             <w:r>
               <w:rPr>
                 <w:rStyle w:val="Hipervnculo"/>
@@ -2410,7 +2417,7 @@
                 <w:noProof/>
                 <w:webHidden/>
               </w:rPr>
-              <w:instrText xml:space="preserve"> PAGEREF _Toc207621002 \h </w:instrText>
+              <w:instrText xml:space="preserve"> PAGEREF _Toc208928052 \h </w:instrText>
             </w:r>
             <w:r>
               <w:rPr>
@@ -2453,7 +2460,7 @@
               <w14:ligatures w14:val="none"/>
             </w:rPr>
           </w:pPr>
-          <w:hyperlink w:anchor="_Toc207621003" w:history="1">
+          <w:hyperlink w:anchor="_Toc208928053" w:history="1">
             <w:r>
               <w:rPr>
                 <w:rStyle w:val="Hipervnculo"/>
@@ -2498,7 +2505,7 @@
                 <w:noProof/>
                 <w:webHidden/>
               </w:rPr>
-              <w:instrText xml:space="preserve"> PAGEREF _Toc207621003 \h </w:instrText>
+              <w:instrText xml:space="preserve"> PAGEREF _Toc208928053 \h </w:instrText>
             </w:r>
             <w:r>
               <w:rPr>
@@ -2541,7 +2548,7 @@
               <w14:ligatures w14:val="none"/>
             </w:rPr>
           </w:pPr>
-          <w:hyperlink w:anchor="_Toc207621004" w:history="1">
+          <w:hyperlink w:anchor="_Toc208928054" w:history="1">
             <w:r>
               <w:rPr>
                 <w:rStyle w:val="Hipervnculo"/>
@@ -2586,7 +2593,7 @@
                 <w:noProof/>
                 <w:webHidden/>
               </w:rPr>
-              <w:instrText xml:space="preserve"> PAGEREF _Toc207621004 \h </w:instrText>
+              <w:instrText xml:space="preserve"> PAGEREF _Toc208928054 \h </w:instrText>
             </w:r>
             <w:r>
               <w:rPr>
@@ -2629,7 +2636,7 @@
               <w14:ligatures w14:val="none"/>
             </w:rPr>
           </w:pPr>
-          <w:hyperlink w:anchor="_Toc207621005" w:history="1">
+          <w:hyperlink w:anchor="_Toc208928055" w:history="1">
             <w:r>
               <w:rPr>
                 <w:rStyle w:val="Hipervnculo"/>
@@ -2674,7 +2681,7 @@
                 <w:noProof/>
                 <w:webHidden/>
               </w:rPr>
-              <w:instrText xml:space="preserve"> PAGEREF _Toc207621005 \h </w:instrText>
+              <w:instrText xml:space="preserve"> PAGEREF _Toc208928055 \h </w:instrText>
             </w:r>
             <w:r>
               <w:rPr>
@@ -2720,7 +2727,7 @@
               <w14:ligatures w14:val="none"/>
             </w:rPr>
           </w:pPr>
-          <w:hyperlink w:anchor="_Toc207621006" w:history="1">
+          <w:hyperlink w:anchor="_Toc208928056" w:history="1">
             <w:r>
               <w:rPr>
                 <w:rStyle w:val="Hipervnculo"/>
@@ -2747,7 +2754,7 @@
                 <w:noProof/>
                 <w:webHidden/>
               </w:rPr>
-              <w:instrText xml:space="preserve"> PAGEREF _Toc207621006 \h </w:instrText>
+              <w:instrText xml:space="preserve"> PAGEREF _Toc208928056 \h </w:instrText>
             </w:r>
             <w:r>
               <w:rPr>
@@ -2793,7 +2800,7 @@
               <w14:ligatures w14:val="none"/>
             </w:rPr>
           </w:pPr>
-          <w:hyperlink w:anchor="_Toc207621007" w:history="1">
+          <w:hyperlink w:anchor="_Toc208928057" w:history="1">
             <w:r>
               <w:rPr>
                 <w:rStyle w:val="Hipervnculo"/>
@@ -2820,7 +2827,7 @@
                 <w:noProof/>
                 <w:webHidden/>
               </w:rPr>
-              <w:instrText xml:space="preserve"> PAGEREF _Toc207621007 \h </w:instrText>
+              <w:instrText xml:space="preserve"> PAGEREF _Toc208928057 \h </w:instrText>
             </w:r>
             <w:r>
               <w:rPr>
@@ -2866,7 +2873,7 @@
               <w14:ligatures w14:val="none"/>
             </w:rPr>
           </w:pPr>
-          <w:hyperlink w:anchor="_Toc207621008" w:history="1">
+          <w:hyperlink w:anchor="_Toc208928058" w:history="1">
             <w:r>
               <w:rPr>
                 <w:rStyle w:val="Hipervnculo"/>
@@ -2893,7 +2900,7 @@
                 <w:noProof/>
                 <w:webHidden/>
               </w:rPr>
-              <w:instrText xml:space="preserve"> PAGEREF _Toc207621008 \h </w:instrText>
+              <w:instrText xml:space="preserve"> PAGEREF _Toc208928058 \h </w:instrText>
             </w:r>
             <w:r>
               <w:rPr>
@@ -2939,7 +2946,7 @@
               <w14:ligatures w14:val="none"/>
             </w:rPr>
           </w:pPr>
-          <w:hyperlink w:anchor="_Toc207621009" w:history="1">
+          <w:hyperlink w:anchor="_Toc208928059" w:history="1">
             <w:r>
               <w:rPr>
                 <w:rStyle w:val="Hipervnculo"/>
@@ -2966,7 +2973,7 @@
                 <w:noProof/>
                 <w:webHidden/>
               </w:rPr>
-              <w:instrText xml:space="preserve"> PAGEREF _Toc207621009 \h </w:instrText>
+              <w:instrText xml:space="preserve"> PAGEREF _Toc208928059 \h </w:instrText>
             </w:r>
             <w:r>
               <w:rPr>
@@ -3012,7 +3019,7 @@
               <w14:ligatures w14:val="none"/>
             </w:rPr>
           </w:pPr>
-          <w:hyperlink w:anchor="_Toc207621010" w:history="1">
+          <w:hyperlink w:anchor="_Toc208928060" w:history="1">
             <w:r>
               <w:rPr>
                 <w:rStyle w:val="Hipervnculo"/>
@@ -3039,7 +3046,7 @@
                 <w:noProof/>
                 <w:webHidden/>
               </w:rPr>
-              <w:instrText xml:space="preserve"> PAGEREF _Toc207621010 \h </w:instrText>
+              <w:instrText xml:space="preserve"> PAGEREF _Toc208928060 \h </w:instrText>
             </w:r>
             <w:r>
               <w:rPr>
@@ -3104,7 +3111,7 @@
       <w:pPr>
         <w:pStyle w:val="Titulosgenerales"/>
       </w:pPr>
-      <w:bookmarkStart w:id="0" w:name="_Toc207620982"/>
+      <w:bookmarkStart w:id="0" w:name="_Toc208928032"/>
       <w:r>
         <w:lastRenderedPageBreak/>
         <w:t>Introducción</w:t>
@@ -3465,7 +3472,7 @@
       <w:pPr>
         <w:pStyle w:val="Ttulo1"/>
       </w:pPr>
-      <w:bookmarkStart w:id="1" w:name="_Toc207620983"/>
+      <w:bookmarkStart w:id="1" w:name="_Toc208928033"/>
       <w:r>
         <w:lastRenderedPageBreak/>
         <w:t>Ecosistema digital</w:t>
@@ -3567,7 +3574,7 @@
       <w:pPr>
         <w:pStyle w:val="Ttulo2"/>
       </w:pPr>
-      <w:bookmarkStart w:id="2" w:name="_Toc207620984"/>
+      <w:bookmarkStart w:id="2" w:name="_Toc208928034"/>
       <w:r>
         <w:t>Redes sociales</w:t>
       </w:r>
@@ -5117,7 +5124,7 @@
       <w:pPr>
         <w:pStyle w:val="Ttulo2"/>
       </w:pPr>
-      <w:bookmarkStart w:id="3" w:name="_Toc207620985"/>
+      <w:bookmarkStart w:id="3" w:name="_Toc208928035"/>
       <w:r>
         <w:lastRenderedPageBreak/>
         <w:t>Audiencias</w:t>
@@ -5487,7 +5494,7 @@
       <w:pPr>
         <w:pStyle w:val="Ttulo1"/>
       </w:pPr>
-      <w:bookmarkStart w:id="4" w:name="_Toc207620986"/>
+      <w:bookmarkStart w:id="4" w:name="_Toc208928036"/>
       <w:r>
         <w:lastRenderedPageBreak/>
         <w:t>Plan de redes sociales</w:t>
@@ -5511,7 +5518,7 @@
       <w:pPr>
         <w:pStyle w:val="Ttulo2"/>
       </w:pPr>
-      <w:bookmarkStart w:id="5" w:name="_Toc207620987"/>
+      <w:bookmarkStart w:id="5" w:name="_Toc208928037"/>
       <w:r>
         <w:t>Elementos</w:t>
       </w:r>
@@ -5568,16 +5575,15 @@
     </w:p>
     <w:p>
       <w:pPr>
-        <w:ind w:firstLine="0"/>
-        <w:rPr>
-          <w:lang w:val="es-419" w:eastAsia="es-CO"/>
-        </w:rPr>
-      </w:pPr>
-      <w:r>
-        <w:rPr>
-          <w:lang w:val="es-419" w:eastAsia="es-CO"/>
-        </w:rPr>
-        <w:t xml:space="preserve">                                       </w:t>
+        <w:rPr>
+          <w:lang w:val="es-419" w:eastAsia="es-CO"/>
+        </w:rPr>
+      </w:pPr>
+      <w:r>
+        <w:rPr>
+          <w:lang w:val="es-419" w:eastAsia="es-CO"/>
+        </w:rPr>
+        <w:t xml:space="preserve">                           </w:t>
       </w:r>
       <w:r>
         <w:rPr>
@@ -5585,10 +5591,10 @@
           <w:lang w:val="es-419" w:eastAsia="es-CO"/>
         </w:rPr>
         <w:drawing>
-          <wp:inline distT="0" distB="0" distL="0" distR="0" wp14:anchorId="32AD758B" wp14:editId="153F5A1C">
-            <wp:extent cx="3209587" cy="3329796"/>
-            <wp:effectExtent l="0" t="0" r="0" b="4445"/>
-            <wp:docPr id="2" name="Imagen 2" descr="En la figura se muestran los elementos que componen un plan de redes sociales.&#10;Plan de redes sociales&#10;Objetivos&#10;Audiencia&#10;Plataformas&#10;Contenido&#10;Métricas y análisis&#10;"/>
+          <wp:inline distT="0" distB="0" distL="0" distR="0" wp14:anchorId="63EB755A" wp14:editId="32267223">
+            <wp:extent cx="3105150" cy="3221448"/>
+            <wp:effectExtent l="0" t="0" r="0" b="0"/>
+            <wp:docPr id="9" name="Imagen 9" descr="En la figura se muestran los elementos que componen un plan de redes sociales.&#10;Plan de redes sociales&#10;Objetivos&#10;Audiencia&#10;Plataformas&#10;Contenido&#10;Métricas y análisis&#10;"/>
             <wp:cNvGraphicFramePr>
               <a:graphicFrameLocks xmlns:a="http://schemas.openxmlformats.org/drawingml/2006/main" noChangeAspect="1"/>
             </wp:cNvGraphicFramePr>
@@ -5596,7 +5602,7 @@
               <a:graphicData uri="http://schemas.openxmlformats.org/drawingml/2006/picture">
                 <pic:pic xmlns:pic="http://schemas.openxmlformats.org/drawingml/2006/picture">
                   <pic:nvPicPr>
-                    <pic:cNvPr id="2" name="Imagen 2" descr="En la figura se muestran los elementos que componen un plan de redes sociales.&#10;Plan de redes sociales&#10;Objetivos&#10;Audiencia&#10;Plataformas&#10;Contenido&#10;Métricas y análisis&#10;"/>
+                    <pic:cNvPr id="9" name="Imagen 9" descr="En la figura se muestran los elementos que componen un plan de redes sociales.&#10;Plan de redes sociales&#10;Objetivos&#10;Audiencia&#10;Plataformas&#10;Contenido&#10;Métricas y análisis&#10;"/>
                     <pic:cNvPicPr/>
                   </pic:nvPicPr>
                   <pic:blipFill>
@@ -5614,7 +5620,7 @@
                   <pic:spPr>
                     <a:xfrm>
                       <a:off x="0" y="0"/>
-                      <a:ext cx="3224671" cy="3345445"/>
+                      <a:ext cx="3110221" cy="3226709"/>
                     </a:xfrm>
                     <a:prstGeom prst="rect">
                       <a:avLst/>
@@ -5646,14 +5652,6 @@
         <w:rPr>
           <w:b/>
           <w:bCs/>
-          <w:lang w:val="es-419" w:eastAsia="es-CO"/>
-        </w:rPr>
-        <w:t xml:space="preserve"> </w:t>
-      </w:r>
-      <w:r>
-        <w:rPr>
-          <w:b/>
-          <w:bCs/>
           <w:sz w:val="24"/>
           <w:szCs w:val="24"/>
           <w:lang w:val="es-419" w:eastAsia="es-CO"/>
@@ -5673,7 +5671,7 @@
       <w:pPr>
         <w:pStyle w:val="Ttulo2"/>
       </w:pPr>
-      <w:bookmarkStart w:id="6" w:name="_Toc207620988"/>
+      <w:bookmarkStart w:id="6" w:name="_Toc208928038"/>
       <w:r>
         <w:t>Características</w:t>
       </w:r>
@@ -5850,7 +5848,7 @@
       <w:pPr>
         <w:pStyle w:val="Ttulo2"/>
       </w:pPr>
-      <w:bookmarkStart w:id="7" w:name="_Toc207620989"/>
+      <w:bookmarkStart w:id="7" w:name="_Toc208928039"/>
       <w:r>
         <w:t>Estructura</w:t>
       </w:r>
@@ -6218,7 +6216,7 @@
       <w:pPr>
         <w:pStyle w:val="Ttulo1"/>
       </w:pPr>
-      <w:bookmarkStart w:id="8" w:name="_Toc207620990"/>
+      <w:bookmarkStart w:id="8" w:name="_Toc208928040"/>
       <w:r>
         <w:lastRenderedPageBreak/>
         <w:t>Estrategias de contenido</w:t>
@@ -6242,7 +6240,7 @@
       <w:pPr>
         <w:pStyle w:val="Ttulo2"/>
       </w:pPr>
-      <w:bookmarkStart w:id="9" w:name="_Toc207620991"/>
+      <w:bookmarkStart w:id="9" w:name="_Toc208928041"/>
       <w:r>
         <w:t>Tipos</w:t>
       </w:r>
@@ -6277,7 +6275,7 @@
       <w:pPr>
         <w:pStyle w:val="Ttulo2"/>
       </w:pPr>
-      <w:bookmarkStart w:id="10" w:name="_Toc207620992"/>
+      <w:bookmarkStart w:id="10" w:name="_Toc208928042"/>
       <w:r>
         <w:t>Componentes</w:t>
       </w:r>
@@ -6472,7 +6470,7 @@
       <w:pPr>
         <w:pStyle w:val="Ttulo2"/>
       </w:pPr>
-      <w:bookmarkStart w:id="11" w:name="_Toc207620993"/>
+      <w:bookmarkStart w:id="11" w:name="_Toc208928043"/>
       <w:r>
         <w:t>Adaptabilidad</w:t>
       </w:r>
@@ -6676,7 +6674,7 @@
       <w:pPr>
         <w:pStyle w:val="Ttulo2"/>
       </w:pPr>
-      <w:bookmarkStart w:id="12" w:name="_Toc207620994"/>
+      <w:bookmarkStart w:id="12" w:name="_Toc208928044"/>
       <w:r>
         <w:t>Viralidad</w:t>
       </w:r>
@@ -6854,7 +6852,7 @@
       <w:pPr>
         <w:pStyle w:val="Ttulo2"/>
       </w:pPr>
-      <w:bookmarkStart w:id="13" w:name="_Toc207620995"/>
+      <w:bookmarkStart w:id="13" w:name="_Toc208928045"/>
       <w:r>
         <w:t>Automatización</w:t>
       </w:r>
@@ -7612,7 +7610,7 @@
       <w:pPr>
         <w:pStyle w:val="Ttulo2"/>
       </w:pPr>
-      <w:bookmarkStart w:id="14" w:name="_Toc207620996"/>
+      <w:bookmarkStart w:id="14" w:name="_Toc208928046"/>
       <w:r>
         <w:t>Inteligencia artificial</w:t>
       </w:r>
@@ -8222,7 +8220,7 @@
       <w:pPr>
         <w:pStyle w:val="Ttulo1"/>
       </w:pPr>
-      <w:bookmarkStart w:id="15" w:name="_Toc207620997"/>
+      <w:bookmarkStart w:id="15" w:name="_Toc208928047"/>
       <w:r>
         <w:lastRenderedPageBreak/>
         <w:t xml:space="preserve">Publicación y </w:t>
@@ -8733,7 +8731,7 @@
       <w:pPr>
         <w:pStyle w:val="Ttulo1"/>
       </w:pPr>
-      <w:bookmarkStart w:id="16" w:name="_Toc207620998"/>
+      <w:bookmarkStart w:id="16" w:name="_Toc208928048"/>
       <w:r>
         <w:lastRenderedPageBreak/>
         <w:t>Interacción</w:t>
@@ -8903,7 +8901,7 @@
       <w:pPr>
         <w:pStyle w:val="Ttulo2"/>
       </w:pPr>
-      <w:bookmarkStart w:id="17" w:name="_Toc207620999"/>
+      <w:bookmarkStart w:id="17" w:name="_Toc208928049"/>
       <w:r>
         <w:t>Principios</w:t>
       </w:r>
@@ -8933,7 +8931,7 @@
       <w:pPr>
         <w:pStyle w:val="Ttulo2"/>
       </w:pPr>
-      <w:bookmarkStart w:id="18" w:name="_Toc207621000"/>
+      <w:bookmarkStart w:id="18" w:name="_Toc208928050"/>
       <w:r>
         <w:t>Fomento</w:t>
       </w:r>
@@ -9320,7 +9318,7 @@
       <w:pPr>
         <w:pStyle w:val="Ttulo2"/>
       </w:pPr>
-      <w:bookmarkStart w:id="19" w:name="_Toc207621001"/>
+      <w:bookmarkStart w:id="19" w:name="_Toc208928051"/>
       <w:r>
         <w:t>Medición de participación</w:t>
       </w:r>
@@ -9524,7 +9522,7 @@
       <w:pPr>
         <w:pStyle w:val="Ttulo1"/>
       </w:pPr>
-      <w:bookmarkStart w:id="20" w:name="_Toc207621002"/>
+      <w:bookmarkStart w:id="20" w:name="_Toc208928052"/>
       <w:r>
         <w:lastRenderedPageBreak/>
         <w:t xml:space="preserve">Confidencialidad de la </w:t>
@@ -9554,7 +9552,7 @@
       <w:pPr>
         <w:pStyle w:val="Ttulo2"/>
       </w:pPr>
-      <w:bookmarkStart w:id="21" w:name="_Toc207621003"/>
+      <w:bookmarkStart w:id="21" w:name="_Toc208928053"/>
       <w:r>
         <w:t>Normatividad</w:t>
       </w:r>
@@ -9624,7 +9622,19 @@
         <w:rPr>
           <w:lang w:val="es-419" w:eastAsia="es-CO"/>
         </w:rPr>
-        <w:t>: regula el tratamiento de datos personales y establece derechos como el habeas data.</w:t>
+        <w:t xml:space="preserve">: regula el tratamiento de datos personales y establece derechos como el </w:t>
+      </w:r>
+      <w:r>
+        <w:rPr>
+          <w:rStyle w:val="Extranjerismo"/>
+        </w:rPr>
+        <w:t>habeas data</w:t>
+      </w:r>
+      <w:r>
+        <w:rPr>
+          <w:lang w:val="es-419" w:eastAsia="es-CO"/>
+        </w:rPr>
+        <w:t>.</w:t>
       </w:r>
     </w:p>
     <w:p>
@@ -9704,7 +9714,7 @@
       <w:pPr>
         <w:pStyle w:val="Ttulo2"/>
       </w:pPr>
-      <w:bookmarkStart w:id="22" w:name="_Toc207621004"/>
+      <w:bookmarkStart w:id="22" w:name="_Toc208928054"/>
       <w:r>
         <w:t xml:space="preserve">Privacidad de datos en redes </w:t>
       </w:r>
@@ -9748,10 +9758,10 @@
           <w:lang w:val="es-419" w:eastAsia="es-CO"/>
         </w:rPr>
         <w:drawing>
-          <wp:inline distT="0" distB="0" distL="0" distR="0" wp14:anchorId="79A58EBE" wp14:editId="7E982F58">
+          <wp:inline distT="0" distB="0" distL="0" distR="0" wp14:anchorId="79A58EBE" wp14:editId="53D0C989">
             <wp:extent cx="6332220" cy="2704465"/>
             <wp:effectExtent l="0" t="0" r="0" b="635"/>
-            <wp:docPr id="4" name="Imagen 4" descr="Consentimiento explícito: las plataformas deben obtener autorización clara para el uso de datos personales.&#10;Configuraciones de privacidad: los usuarios deben tener control sobre quién accede a su información.&#10;Cifrado de datos: la seguridad en la transmisión de información es esencial para evitar filtraciones.&#10;Uso de algoritmos de IA: la recopilación de datos debe ser transparente y ética.&#10;"/>
+            <wp:docPr id="4" name="Imagen 4" descr="La figura muestra cuatro aspectos claves de privacidad de datos en redes sociales.&#10;Consentimiento explícito: las plataformas deben obtener autorización clara para el uso de datos personales.&#10;Configuraciones de privacidad: los usuarios deben tener control sobre quién accede a su información.&#10;Cifrado de datos: la seguridad en la transmisión de información es esencial para evitar filtraciones.&#10;Uso de algoritmos de IA: la recopilación de datos debe ser transparente y ética.&#10;"/>
             <wp:cNvGraphicFramePr>
               <a:graphicFrameLocks xmlns:a="http://schemas.openxmlformats.org/drawingml/2006/main" noChangeAspect="1"/>
             </wp:cNvGraphicFramePr>
@@ -9759,7 +9769,7 @@
               <a:graphicData uri="http://schemas.openxmlformats.org/drawingml/2006/picture">
                 <pic:pic xmlns:pic="http://schemas.openxmlformats.org/drawingml/2006/picture">
                   <pic:nvPicPr>
-                    <pic:cNvPr id="4" name="Imagen 4" descr="Consentimiento explícito: las plataformas deben obtener autorización clara para el uso de datos personales.&#10;Configuraciones de privacidad: los usuarios deben tener control sobre quién accede a su información.&#10;Cifrado de datos: la seguridad en la transmisión de información es esencial para evitar filtraciones.&#10;Uso de algoritmos de IA: la recopilación de datos debe ser transparente y ética.&#10;"/>
+                    <pic:cNvPr id="4" name="Imagen 4" descr="La figura muestra cuatro aspectos claves de privacidad de datos en redes sociales.&#10;Consentimiento explícito: las plataformas deben obtener autorización clara para el uso de datos personales.&#10;Configuraciones de privacidad: los usuarios deben tener control sobre quién accede a su información.&#10;Cifrado de datos: la seguridad en la transmisión de información es esencial para evitar filtraciones.&#10;Uso de algoritmos de IA: la recopilación de datos debe ser transparente y ética.&#10;"/>
                     <pic:cNvPicPr/>
                   </pic:nvPicPr>
                   <pic:blipFill>
@@ -9822,7 +9832,7 @@
       <w:pPr>
         <w:pStyle w:val="Ttulo2"/>
       </w:pPr>
-      <w:bookmarkStart w:id="23" w:name="_Toc207621005"/>
+      <w:bookmarkStart w:id="23" w:name="_Toc208928055"/>
       <w:r>
         <w:t>Ética en el manejo de la información</w:t>
       </w:r>
@@ -9953,7 +9963,7 @@
       <w:pPr>
         <w:pStyle w:val="Titulosgenerales"/>
       </w:pPr>
-      <w:bookmarkStart w:id="24" w:name="_Toc207621006"/>
+      <w:bookmarkStart w:id="24" w:name="_Toc208928056"/>
       <w:r>
         <w:lastRenderedPageBreak/>
         <w:t>Síntesis</w:t>
@@ -10062,7 +10072,7 @@
       <w:pPr>
         <w:pStyle w:val="Titulosgenerales"/>
       </w:pPr>
-      <w:bookmarkStart w:id="25" w:name="_Toc207621007"/>
+      <w:bookmarkStart w:id="25" w:name="_Toc208928057"/>
       <w:r>
         <w:lastRenderedPageBreak/>
         <w:t>Glosario</w:t>
@@ -10668,7 +10678,7 @@
       <w:pPr>
         <w:pStyle w:val="Titulosgenerales"/>
       </w:pPr>
-      <w:bookmarkStart w:id="26" w:name="_Toc207621008"/>
+      <w:bookmarkStart w:id="26" w:name="_Toc208928058"/>
       <w:r>
         <w:lastRenderedPageBreak/>
         <w:t>Material complementario</w:t>
@@ -11519,7 +11529,7 @@
       <w:pPr>
         <w:pStyle w:val="Titulosgenerales"/>
       </w:pPr>
-      <w:bookmarkStart w:id="27" w:name="_Toc207621009"/>
+      <w:bookmarkStart w:id="27" w:name="_Toc208928059"/>
       <w:r>
         <w:lastRenderedPageBreak/>
         <w:t>Referencias bibliográficas</w:t>
@@ -12233,7 +12243,7 @@
       <w:pPr>
         <w:pStyle w:val="Titulosgenerales"/>
       </w:pPr>
-      <w:bookmarkStart w:id="28" w:name="_Toc207621010"/>
+      <w:bookmarkStart w:id="28" w:name="_Toc208928060"/>
       <w:r>
         <w:lastRenderedPageBreak/>
         <w:t>C</w:t>
@@ -17073,6 +17083,26 @@
 </file>
 
 <file path=customXml/item1.xml><?xml version="1.0" encoding="utf-8"?>
+<p:properties xmlns:p="http://schemas.microsoft.com/office/2006/metadata/properties" xmlns:xsi="http://www.w3.org/2001/XMLSchema-instance" xmlns:pc="http://schemas.microsoft.com/office/infopath/2007/PartnerControls">
+  <documentManagement>
+    <TaxCatchAll xmlns="cb45339b-ced9-4d0d-8f64-77573914d53b"/>
+    <lcf76f155ced4ddcb4097134ff3c332f xmlns="43a3ca16-9c26-4813-b83f-4aec9927b43f">
+      <Terms xmlns="http://schemas.microsoft.com/office/infopath/2007/PartnerControls"/>
+    </lcf76f155ced4ddcb4097134ff3c332f>
+  </documentManagement>
+</p:properties>
+</file>
+
+<file path=customXml/item2.xml><?xml version="1.0" encoding="utf-8"?>
+<?mso-contentType ?>
+<FormTemplates xmlns="http://schemas.microsoft.com/sharepoint/v3/contenttype/forms">
+  <Display>DocumentLibraryForm</Display>
+  <Edit>DocumentLibraryForm</Edit>
+  <New>DocumentLibraryForm</New>
+</FormTemplates>
+</file>
+
+<file path=customXml/item3.xml><?xml version="1.0" encoding="utf-8"?>
 <ct:contentTypeSchema xmlns:ct="http://schemas.microsoft.com/office/2006/metadata/contentType" xmlns:ma="http://schemas.microsoft.com/office/2006/metadata/properties/metaAttributes" ct:_="" ma:_="" ma:contentTypeName="Documento" ma:contentTypeID="0x01010049282E1EDBE9234EA9E6D38F720E265F" ma:contentTypeVersion="15" ma:contentTypeDescription="Crear nuevo documento." ma:contentTypeScope="" ma:versionID="b31c7aa9eaf043a08b87120b3c4916e3">
   <xsd:schema xmlns:xsd="http://www.w3.org/2001/XMLSchema" xmlns:xs="http://www.w3.org/2001/XMLSchema" xmlns:p="http://schemas.microsoft.com/office/2006/metadata/properties" xmlns:ns2="cb45339b-ced9-4d0d-8f64-77573914d53b" xmlns:ns3="43a3ca16-9c26-4813-b83f-4aec9927b43f" targetNamespace="http://schemas.microsoft.com/office/2006/metadata/properties" ma:root="true" ma:fieldsID="3533d065b04d75c457075bc55f1f5315" ns2:_="" ns3:_="">
     <xsd:import namespace="cb45339b-ced9-4d0d-8f64-77573914d53b"/>
@@ -17307,31 +17337,30 @@
 </ct:contentTypeSchema>
 </file>
 
-<file path=customXml/item2.xml><?xml version="1.0" encoding="utf-8"?>
+<file path=customXml/item4.xml><?xml version="1.0" encoding="utf-8"?>
 <b:Sources xmlns:b="http://schemas.openxmlformats.org/officeDocument/2006/bibliography" xmlns="http://schemas.openxmlformats.org/officeDocument/2006/bibliography" SelectedStyle="\APASixthEditionOfficeOnline.xsl" StyleName="APA" Version="6"/>
 </file>
 
-<file path=customXml/item3.xml><?xml version="1.0" encoding="utf-8"?>
-<p:properties xmlns:p="http://schemas.microsoft.com/office/2006/metadata/properties" xmlns:xsi="http://www.w3.org/2001/XMLSchema-instance" xmlns:pc="http://schemas.microsoft.com/office/infopath/2007/PartnerControls">
-  <documentManagement>
-    <TaxCatchAll xmlns="cb45339b-ced9-4d0d-8f64-77573914d53b"/>
-    <lcf76f155ced4ddcb4097134ff3c332f xmlns="43a3ca16-9c26-4813-b83f-4aec9927b43f">
-      <Terms xmlns="http://schemas.microsoft.com/office/infopath/2007/PartnerControls"/>
-    </lcf76f155ced4ddcb4097134ff3c332f>
-  </documentManagement>
-</p:properties>
+<file path=customXml/itemProps1.xml><?xml version="1.0" encoding="utf-8"?>
+<ds:datastoreItem xmlns:ds="http://schemas.openxmlformats.org/officeDocument/2006/customXml" ds:itemID="{1145D752-ACC1-45E1-AB53-0C756F67FC7F}">
+  <ds:schemaRefs>
+    <ds:schemaRef ds:uri="http://schemas.microsoft.com/office/2006/metadata/properties"/>
+    <ds:schemaRef ds:uri="http://schemas.microsoft.com/office/infopath/2007/PartnerControls"/>
+    <ds:schemaRef ds:uri="cb45339b-ced9-4d0d-8f64-77573914d53b"/>
+    <ds:schemaRef ds:uri="43a3ca16-9c26-4813-b83f-4aec9927b43f"/>
+  </ds:schemaRefs>
+</ds:datastoreItem>
 </file>
 
-<file path=customXml/item4.xml><?xml version="1.0" encoding="utf-8"?>
-<?mso-contentType ?>
-<FormTemplates xmlns="http://schemas.microsoft.com/sharepoint/v3/contenttype/forms">
-  <Display>DocumentLibraryForm</Display>
-  <Edit>DocumentLibraryForm</Edit>
-  <New>DocumentLibraryForm</New>
-</FormTemplates>
+<file path=customXml/itemProps2.xml><?xml version="1.0" encoding="utf-8"?>
+<ds:datastoreItem xmlns:ds="http://schemas.openxmlformats.org/officeDocument/2006/customXml" ds:itemID="{81CBDEC1-3B00-44ED-AD36-0268077980BA}">
+  <ds:schemaRefs>
+    <ds:schemaRef ds:uri="http://schemas.microsoft.com/sharepoint/v3/contenttype/forms"/>
+  </ds:schemaRefs>
+</ds:datastoreItem>
 </file>
 
-<file path=customXml/itemProps1.xml><?xml version="1.0" encoding="utf-8"?>
+<file path=customXml/itemProps3.xml><?xml version="1.0" encoding="utf-8"?>
 <ds:datastoreItem xmlns:ds="http://schemas.openxmlformats.org/officeDocument/2006/customXml" ds:itemID="{DF43E046-DB0C-42D1-8C73-AE38B52F1ED7}">
   <ds:schemaRefs>
     <ds:schemaRef ds:uri="http://schemas.microsoft.com/office/2006/metadata/contentType"/>
@@ -17350,29 +17379,10 @@
 </ds:datastoreItem>
 </file>
 
-<file path=customXml/itemProps2.xml><?xml version="1.0" encoding="utf-8"?>
+<file path=customXml/itemProps4.xml><?xml version="1.0" encoding="utf-8"?>
 <ds:datastoreItem xmlns:ds="http://schemas.openxmlformats.org/officeDocument/2006/customXml" ds:itemID="{E8AB44A3-7C62-4BD2-82ED-8ABC209970FA}">
   <ds:schemaRefs>
     <ds:schemaRef ds:uri="http://schemas.openxmlformats.org/officeDocument/2006/bibliography"/>
   </ds:schemaRefs>
 </ds:datastoreItem>
-</file>
-
-<file path=customXml/itemProps3.xml><?xml version="1.0" encoding="utf-8"?>
-<ds:datastoreItem xmlns:ds="http://schemas.openxmlformats.org/officeDocument/2006/customXml" ds:itemID="{1145D752-ACC1-45E1-AB53-0C756F67FC7F}">
-  <ds:schemaRefs>
-    <ds:schemaRef ds:uri="http://schemas.microsoft.com/office/2006/metadata/properties"/>
-    <ds:schemaRef ds:uri="http://schemas.microsoft.com/office/infopath/2007/PartnerControls"/>
-    <ds:schemaRef ds:uri="cb45339b-ced9-4d0d-8f64-77573914d53b"/>
-    <ds:schemaRef ds:uri="43a3ca16-9c26-4813-b83f-4aec9927b43f"/>
-  </ds:schemaRefs>
-</ds:datastoreItem>
-</file>
-
-<file path=customXml/itemProps4.xml><?xml version="1.0" encoding="utf-8"?>
-<ds:datastoreItem xmlns:ds="http://schemas.openxmlformats.org/officeDocument/2006/customXml" ds:itemID="{81CBDEC1-3B00-44ED-AD36-0268077980BA}">
-  <ds:schemaRefs>
-    <ds:schemaRef ds:uri="http://schemas.microsoft.com/sharepoint/v3/contenttype/forms"/>
-  </ds:schemaRefs>
-</ds:datastoreItem>
 </file>
</xml_diff>